<commit_message>
Corrigido a aula 07 do semestre
</commit_message>
<xml_diff>
--- a/referencias/aula-07/vinheta-1-dona-celina.docx
+++ b/referencias/aula-07/vinheta-1-dona-celina.docx
@@ -267,6 +267,7 @@
           <w:color w:val="4A4A45"/>
           <w:sz w:val="24"/>
         </w:rPr>
+        <w:lastRenderedPageBreak/>
         <w:t>Fez seis meses de fonoaudiologia pelo SUS, interrompidos por falta de vaga. Hoje fala pouco, devagar e com esforço, em frases de uma ou duas palavras. Diz que a palavra “fica presa”. O braço direito melhorou, mas a escrita com a mão direita não voltou.</w:t>
       </w:r>
     </w:p>
@@ -436,6 +437,7 @@
         <w:rPr>
           <w:sz w:val="24"/>
         </w:rPr>
+        <w:lastRenderedPageBreak/>
         <w:t>•  Ouvida a pergunta do ofício lida em voz alta — “a senhora quer vender a sua casa e se mudar para Curitiba?” —, responde “não... não... minha casa” e aponta para si mesma.</w:t>
       </w:r>
     </w:p>
@@ -506,7 +508,7 @@
           <w:color w:val="1D3E6E"/>
           <w:sz w:val="26"/>
         </w:rPr>
-        <w:t>Fluência verbal semântica (animais) — protocolo</w:t>
+        <w:t>Fluência verbal fonêmica (FAS) — protocolo</w:t>
       </w:r>
     </w:p>
     <w:p>
@@ -518,7 +520,7 @@
           <w:color w:val="4A4A45"/>
           <w:sz w:val="24"/>
         </w:rPr>
-        <w:t>Aplicada numa clínica-escola em Santo Amaro, em São Paulo, depois das tarefas de compreensão. Instrução: “Diga o maior número de animais que conseguir lembrar.” Tempo: um minuto, cronometrado a partir do fim da instrução.</w:t>
+        <w:t>Aplicada numa clínica-escola em Santo Amaro, em São Paulo, depois das tarefas de compreensão. Instrução: “Vou dizer uma letra do alfabeto. Quero que a senhora me diga o maior número de palavras que conseguir que comecem com essa letra, o mais rápido possível. Por exemplo, se eu disser B, a senhora pode dizer bola, bonito, mas não pode dizer nomes próprios, como Brasil ou Beatriz. Também não pode dizer a mesma palavra com outra terminação.” Tempo: um minuto para cada letra, na ordem F, A e S, cronometrado a partir da apresentação da letra.</w:t>
       </w:r>
     </w:p>
     <w:p>
@@ -530,7 +532,7 @@
           <w:color w:val="4A4A45"/>
           <w:sz w:val="24"/>
         </w:rPr>
-        <w:t>A instrução foi dada uma vez. Ao terminá-la, a paciente acenou com a cabeça e começou sem pedir repetição. As respostas foram registradas em quatro intervalos de 15 segundos.</w:t>
+        <w:t>A instrução foi dada uma vez. Perguntada se tinha entendido, a paciente acenou com a cabeça. As respostas foram registradas letra a letra.</w:t>
       </w:r>
     </w:p>
     <w:p>
@@ -543,7 +545,7 @@
           <w:color w:val="4A4A45"/>
           <w:sz w:val="24"/>
         </w:rPr>
-        <w:t>As respostas obtidas, intervalo a intervalo</w:t>
+        <w:t>As respostas obtidas, letra a letra</w:t>
       </w:r>
     </w:p>
     <w:tbl>
@@ -604,7 +606,7 @@
                 <w:color w:val="000000"/>
                 <w:sz w:val="19"/>
               </w:rPr>
-              <w:t>Intervalo</w:t>
+              <w:t>Letra</w:t>
             </w:r>
           </w:p>
         </w:tc>
@@ -620,9 +622,17 @@
                 <w:color w:val="000000"/>
                 <w:sz w:val="19"/>
               </w:rPr>
-              <w:t>O que a paciente fez — registro verbatim</w:t>
+              <w:t xml:space="preserve">O que a paciente fez — registro </w:t>
             </w:r>
             <w:proofErr w:type="spellStart"/>
+            <w:r>
+              <w:rPr>
+                <w:b/>
+                <w:color w:val="000000"/>
+                <w:sz w:val="19"/>
+              </w:rPr>
+              <w:t>verbatim</w:t>
+            </w:r>
             <w:proofErr w:type="spellEnd"/>
           </w:p>
         </w:tc>
@@ -668,7 +678,7 @@
                 <w:color w:val="4A4A45"/>
                 <w:sz w:val="19"/>
               </w:rPr>
-              <w:t>0 a 15 s</w:t>
+              <w:t>F</w:t>
             </w:r>
             <w:r>
               <w:rPr>
@@ -676,7 +686,7 @@
                 <w:sz w:val="19"/>
               </w:rPr>
               <w:br/>
-              <w:t>primeiro quarto do minuto</w:t>
+              <w:t>primeiro minuto</w:t>
             </w:r>
           </w:p>
         </w:tc>
@@ -690,12 +700,8 @@
                 <w:color w:val="4A4A45"/>
                 <w:sz w:val="19"/>
               </w:rPr>
-              <w:t>“Cachorro...” Pausa de cerca de cinco segundos. “...gato.”</w:t>
+              <w:t>“Fa... faca.” Pausa de cerca de dez segundos. “...Feijão.” Bate a mão na mesa. “Faca.” Balança a cabeça.</w:t>
             </w:r>
-            <w:proofErr w:type="gramStart"/>
-            <w:proofErr w:type="gramEnd"/>
-            <w:proofErr w:type="gramStart"/>
-            <w:proofErr w:type="gramEnd"/>
           </w:p>
         </w:tc>
         <w:tc>
@@ -730,7 +736,7 @@
                 <w:color w:val="4A4A45"/>
                 <w:sz w:val="19"/>
               </w:rPr>
-              <w:t>15 a 30 s</w:t>
+              <w:t>A</w:t>
             </w:r>
             <w:r>
               <w:rPr>
@@ -738,7 +744,7 @@
                 <w:sz w:val="19"/>
               </w:rPr>
               <w:br/>
-              <w:t>segundo quarto</w:t>
+              <w:t>segundo minuto</w:t>
             </w:r>
           </w:p>
         </w:tc>
@@ -752,7 +758,7 @@
                 <w:color w:val="4A4A45"/>
                 <w:sz w:val="19"/>
               </w:rPr>
-              <w:t>“Gato...” Bate a mão na mesa. “...ca... cadeira.” Balança a cabeça.</w:t>
+              <w:t>“Água...” Pausa longa. “...ár... árvore.” Suspira. “Feijão.”</w:t>
             </w:r>
           </w:p>
         </w:tc>
@@ -788,7 +794,7 @@
                 <w:color w:val="4A4A45"/>
                 <w:sz w:val="19"/>
               </w:rPr>
-              <w:t>30 a 45 s</w:t>
+              <w:t>S</w:t>
             </w:r>
             <w:r>
               <w:rPr>
@@ -796,7 +802,7 @@
                 <w:sz w:val="19"/>
               </w:rPr>
               <w:br/>
-              <w:t>terceiro quarto</w:t>
+              <w:t>terceiro minuto</w:t>
             </w:r>
           </w:p>
         </w:tc>
@@ -810,68 +816,8 @@
                 <w:color w:val="4A4A45"/>
                 <w:sz w:val="19"/>
               </w:rPr>
-              <w:t>“Ga... galinha.” Suspira.</w:t>
+              <w:t>“Sa... sal.” Depois aponta o próprio sapato, tenta falar, não sai som, e balança a cabeça. Encerrado o minuto, diz: “não... sai”.</w:t>
             </w:r>
-          </w:p>
-        </w:tc>
-        <w:tc>
-          <w:tcPr>
-            <w:tcW w:w="900" w:type="dxa"/>
-          </w:tcPr>
-          <w:p/>
-        </w:tc>
-      </w:tr>
-      <w:tr>
-        <w:tc>
-          <w:tcPr>
-            <w:tcW w:w="520" w:type="dxa"/>
-          </w:tcPr>
-          <w:p>
-            <w:r>
-              <w:rPr>
-                <w:color w:val="4A4A45"/>
-                <w:sz w:val="19"/>
-              </w:rPr>
-              <w:t>4</w:t>
-            </w:r>
-          </w:p>
-        </w:tc>
-        <w:tc>
-          <w:tcPr>
-            <w:tcW w:w="2300" w:type="dxa"/>
-          </w:tcPr>
-          <w:p>
-            <w:r>
-              <w:rPr>
-                <w:color w:val="4A4A45"/>
-                <w:sz w:val="19"/>
-              </w:rPr>
-              <w:t>45 a 60 s</w:t>
-            </w:r>
-            <w:r>
-              <w:rPr>
-                <w:color w:val="4A4A45"/>
-                <w:sz w:val="19"/>
-              </w:rPr>
-              <w:br/>
-              <w:t>último quarto</w:t>
-            </w:r>
-          </w:p>
-        </w:tc>
-        <w:tc>
-          <w:tcPr>
-            <w:tcW w:w="5900" w:type="dxa"/>
-          </w:tcPr>
-          <w:p>
-            <w:r>
-              <w:rPr>
-                <w:color w:val="4A4A45"/>
-                <w:sz w:val="19"/>
-              </w:rPr>
-              <w:t>Nenhuma palavra. Faz com as mãos o gesto de asas batendo, tenta falar, não sai som, e balança a cabeça. Encerrado o minuto, diz: “não... sai”.</w:t>
-            </w:r>
-            <w:proofErr w:type="gramStart"/>
-            <w:proofErr w:type="gramEnd"/>
           </w:p>
         </w:tc>
         <w:tc>
@@ -899,7 +845,7 @@
                 <w:color w:val="4A4A45"/>
                 <w:sz w:val="19"/>
               </w:rPr>
-              <w:t>Total de animais válidos</w:t>
+              <w:t>Total de palavras válidas (F + A + S)</w:t>
             </w:r>
           </w:p>
         </w:tc>
@@ -969,7 +915,7 @@
                 <w:color w:val="4A4A45"/>
                 <w:sz w:val="19"/>
               </w:rPr>
-              <w:t>Palavras ditas no minuto</w:t>
+              <w:t>Palavras ditas nos três minutos</w:t>
             </w:r>
           </w:p>
         </w:tc>
@@ -1029,7 +975,7 @@
                 <w:color w:val="4A4A45"/>
                 <w:sz w:val="19"/>
               </w:rPr>
-              <w:t>Palavras fora da categoria</w:t>
+              <w:t>Palavras de outra letra</w:t>
             </w:r>
           </w:p>
         </w:tc>
@@ -1059,10 +1005,9 @@
                 <w:color w:val="4A4A45"/>
                 <w:sz w:val="19"/>
               </w:rPr>
-              <w:t>Animais válidos</w:t>
+              <w:lastRenderedPageBreak/>
+              <w:t>Nomes próprios e mesma palavra com outra terminação</w:t>
             </w:r>
-            <w:proofErr w:type="spellStart"/>
-            <w:proofErr w:type="spellEnd"/>
           </w:p>
         </w:tc>
         <w:tc>
@@ -1091,7 +1036,7 @@
                 <w:color w:val="4A4A45"/>
                 <w:sz w:val="19"/>
               </w:rPr>
-              <w:t>Escolaridade</w:t>
+              <w:t>Palavras válidas (total FAS)</w:t>
             </w:r>
           </w:p>
         </w:tc>
@@ -1105,7 +1050,7 @@
                 <w:color w:val="4A4A45"/>
                 <w:sz w:val="19"/>
               </w:rPr>
-              <w:t>______ anos</w:t>
+              <w:t>______</w:t>
             </w:r>
           </w:p>
         </w:tc>
@@ -1121,7 +1066,7 @@
                 <w:color w:val="4A4A45"/>
                 <w:sz w:val="19"/>
               </w:rPr>
-              <w:t>Ponto de corte para a escolaridade (Brucki et al., 1997)</w:t>
+              <w:t>Idade e escolaridade</w:t>
             </w:r>
           </w:p>
         </w:tc>
@@ -1130,17 +1075,13 @@
             <w:tcW w:w="3400" w:type="dxa"/>
           </w:tcPr>
           <w:p>
-            <w:proofErr w:type="gramStart"/>
             <w:r>
               <w:rPr>
                 <w:color w:val="4A4A45"/>
                 <w:sz w:val="19"/>
               </w:rPr>
-              <w:t>______</w:t>
+              <w:t>______ anos de idade · ______ anos de estudo</w:t>
             </w:r>
-            <w:proofErr w:type="gramEnd"/>
-            <w:proofErr w:type="gramStart"/>
-            <w:proofErr w:type="gramEnd"/>
           </w:p>
         </w:tc>
       </w:tr>
@@ -1155,7 +1096,37 @@
                 <w:color w:val="4A4A45"/>
                 <w:sz w:val="19"/>
               </w:rPr>
-              <w:t>Média da faixa de escolaridade (Brucki e Rocha, 2004)</w:t>
+              <w:t>Percentis 5 e 25 da faixa de idade e escolaridade (Machado et al., 2009)</w:t>
+            </w:r>
+          </w:p>
+        </w:tc>
+        <w:tc>
+          <w:tcPr>
+            <w:tcW w:w="3400" w:type="dxa"/>
+          </w:tcPr>
+          <w:p>
+            <w:r>
+              <w:rPr>
+                <w:color w:val="4A4A45"/>
+                <w:sz w:val="19"/>
+              </w:rPr>
+              <w:t>P5 ______ · P25 ______</w:t>
+            </w:r>
+          </w:p>
+        </w:tc>
+      </w:tr>
+      <w:tr>
+        <w:tc>
+          <w:tcPr>
+            <w:tcW w:w="6200" w:type="dxa"/>
+          </w:tcPr>
+          <w:p>
+            <w:r>
+              <w:rPr>
+                <w:color w:val="4A4A45"/>
+                <w:sz w:val="19"/>
+              </w:rPr>
+              <w:t>Média da faixa de idade e escolaridade (Machado et al., 2009)</w:t>
             </w:r>
           </w:p>
         </w:tc>
@@ -1215,147 +1186,6 @@
     </w:p>
     <w:p>
       <w:pPr>
-        <w:keepNext/>
-        <w:spacing w:before="220" w:after="100"/>
-      </w:pPr>
-      <w:r>
-        <w:rPr>
-          <w:b/>
-          <w:color w:val="1D3E6E"/>
-        </w:rPr>
-        <w:t>Para responder em grupo</w:t>
-      </w:r>
-    </w:p>
-    <w:p>
-      <w:pPr>
-        <w:spacing w:after="60"/>
-        <w:ind w:left="360" w:hanging="220"/>
-        <w:rPr>
-          <w:color w:val="1D3E6E"/>
-          <w:sz w:val="24"/>
-        </w:rPr>
-      </w:pPr>
-      <w:r>
-        <w:rPr>
-          <w:color w:val="1D3E6E"/>
-          <w:sz w:val="24"/>
-        </w:rPr>
-        <w:t xml:space="preserve">•  </w:t>
-      </w:r>
-      <w:r>
-        <w:rPr>
-          <w:color w:val="1D3E6E"/>
-          <w:sz w:val="24"/>
-        </w:rPr>
-        <w:t>Corrijam a fluência verbal: contem os animais válidos e comparem com o ponto de corte da escolaridade da paciente.</w:t>
-      </w:r>
-    </w:p>
-    <w:p>
-      <w:pPr>
-        <w:spacing w:after="60"/>
-        <w:ind w:left="360" w:hanging="220"/>
-        <w:rPr>
-          <w:color w:val="1D3E6E"/>
-          <w:sz w:val="24"/>
-        </w:rPr>
-      </w:pPr>
-      <w:r>
-        <w:rPr>
-          <w:color w:val="1D3E6E"/>
-          <w:sz w:val="24"/>
-        </w:rPr>
-        <w:t xml:space="preserve">•  </w:t>
-      </w:r>
-      <w:r>
-        <w:rPr>
-          <w:color w:val="1D3E6E"/>
-          <w:sz w:val="24"/>
-        </w:rPr>
-        <w:t>Descrevam a linguagem expressiva de Dona Celina a partir do protocolo e da observação. Além do número, o que o modo como as palavras saíram mostra?</w:t>
-      </w:r>
-    </w:p>
-    <w:p>
-      <w:pPr>
-        <w:spacing w:after="60"/>
-        <w:ind w:left="360" w:hanging="220"/>
-        <w:rPr>
-          <w:color w:val="1D3E6E"/>
-          <w:sz w:val="24"/>
-        </w:rPr>
-      </w:pPr>
-      <w:r>
-        <w:rPr>
-          <w:color w:val="1D3E6E"/>
-          <w:sz w:val="24"/>
-        </w:rPr>
-        <w:t xml:space="preserve">•  </w:t>
-      </w:r>
-      <w:r>
-        <w:rPr>
-          <w:color w:val="1D3E6E"/>
-          <w:sz w:val="24"/>
-        </w:rPr>
-        <w:t>Separem, nas observações, cada dado que informa sobre a compreensão. O que cada um deles exigiu dela?</w:t>
-      </w:r>
-    </w:p>
-    <w:p>
-      <w:pPr>
-        <w:spacing w:after="60"/>
-        <w:ind w:left="360" w:hanging="220"/>
-        <w:rPr>
-          <w:color w:val="1D3E6E"/>
-          <w:sz w:val="24"/>
-        </w:rPr>
-      </w:pPr>
-      <w:r>
-        <w:rPr>
-          <w:color w:val="1D3E6E"/>
-          <w:sz w:val="24"/>
-        </w:rPr>
-        <w:t xml:space="preserve">•  </w:t>
-      </w:r>
-      <w:r>
-        <w:rPr>
-          <w:color w:val="1D3E6E"/>
-          <w:sz w:val="24"/>
-        </w:rPr>
-        <w:t>O escore baixo na fluência permite concluir algo sobre a compreensão? Por quê?</w:t>
-      </w:r>
-    </w:p>
-    <w:p>
-      <w:pPr>
-        <w:spacing w:after="60"/>
-        <w:ind w:left="360" w:hanging="220"/>
-        <w:rPr>
-          <w:color w:val="1D3E6E"/>
-          <w:sz w:val="24"/>
-        </w:rPr>
-      </w:pPr>
-      <w:r>
-        <w:rPr>
-          <w:color w:val="1D3E6E"/>
-          <w:sz w:val="24"/>
-        </w:rPr>
-        <w:t xml:space="preserve">•  </w:t>
-      </w:r>
-      <w:r>
-        <w:rPr>
-          <w:color w:val="1D3E6E"/>
-          <w:sz w:val="24"/>
-        </w:rPr>
-        <w:t>Respondam à pergunta do juiz em linguagem descritiva, sem diagnóstico, apoiando cada afirmação num dado da ficha.</w:t>
-      </w:r>
-    </w:p>
-    <w:p>
-      <w:pPr>
-        <w:pBdr>
-          <w:bottom w:val="single" w:sz="6" w:space="1" w:color="D5D4CC"/>
-        </w:pBdr>
-        <w:spacing w:before="160" w:after="200"/>
-      </w:pPr>
-    </w:p>
-    <w:p>
-      <w:pPr>
         <w:spacing w:after="140"/>
       </w:pPr>
       <w:r>
@@ -1363,7 +1193,21 @@
           <w:color w:val="4A4A45"/>
           <w:sz w:val="24"/>
         </w:rPr>
-        <w:t>Com base na discussão, escrevam um parágrafo de resumo dos achados.</w:t>
+        <w:t>Com base na discussão, escrevam um parágrafo de resumo dos achados</w:t>
+      </w:r>
+      <w:r>
+        <w:rPr>
+          <w:color w:val="4A4A45"/>
+          <w:sz w:val="24"/>
+        </w:rPr>
+        <w:t xml:space="preserve"> respondendo à pergunta do juiz</w:t>
+      </w:r>
+      <w:r>
+        <w:rPr>
+          <w:color w:val="4A4A45"/>
+          <w:sz w:val="24"/>
+        </w:rPr>
+        <w:t>.</w:t>
       </w:r>
     </w:p>
     <w:p>

</xml_diff>

<commit_message>
Atualiza vinheta 1 (Dona Celina) da aula 07
</commit_message>
<xml_diff>
--- a/referencias/aula-07/vinheta-1-dona-celina.docx
+++ b/referencias/aula-07/vinheta-1-dona-celina.docx
@@ -206,7 +206,65 @@
           <w:color w:val="4A4A45"/>
           <w:sz w:val="24"/>
         </w:rPr>
-        <w:t>Casada há 55 anos com Dirceu, 79, ex-cobrador de ônibus, que tem insuficiência cardíaca e anda com dificuldade. Dois filhos: Rosana, 52, que mora a duas quadras e a visita todos os dias, e Márcio, 49, que mora em Curitiba. Três netos.</w:t>
+        <w:t>Casada há 55 anos com Dirceu, 79</w:t>
+      </w:r>
+      <w:r>
+        <w:rPr>
+          <w:color w:val="4A4A45"/>
+          <w:sz w:val="24"/>
+        </w:rPr>
+        <w:t xml:space="preserve"> anos</w:t>
+      </w:r>
+      <w:r>
+        <w:rPr>
+          <w:color w:val="4A4A45"/>
+          <w:sz w:val="24"/>
+        </w:rPr>
+        <w:t xml:space="preserve">, </w:t>
+      </w:r>
+      <w:proofErr w:type="spellStart"/>
+      <w:r>
+        <w:rPr>
+          <w:color w:val="4A4A45"/>
+          <w:sz w:val="24"/>
+        </w:rPr>
+        <w:t>ex-cobrador</w:t>
+      </w:r>
+      <w:proofErr w:type="spellEnd"/>
+      <w:r>
+        <w:rPr>
+          <w:color w:val="4A4A45"/>
+          <w:sz w:val="24"/>
+        </w:rPr>
+        <w:t xml:space="preserve"> de ônibus, que tem insuficiência cardíaca e anda com dificuldade. Dois filhos: Rosana, 52</w:t>
+      </w:r>
+      <w:r>
+        <w:rPr>
+          <w:color w:val="4A4A45"/>
+          <w:sz w:val="24"/>
+        </w:rPr>
+        <w:t xml:space="preserve"> anos</w:t>
+      </w:r>
+      <w:r>
+        <w:rPr>
+          <w:color w:val="4A4A45"/>
+          <w:sz w:val="24"/>
+        </w:rPr>
+        <w:t>, que mora a duas quadras e a visita todos os dias, e Márcio, 49</w:t>
+      </w:r>
+      <w:r>
+        <w:rPr>
+          <w:color w:val="4A4A45"/>
+          <w:sz w:val="24"/>
+        </w:rPr>
+        <w:t xml:space="preserve"> anos</w:t>
+      </w:r>
+      <w:r>
+        <w:rPr>
+          <w:color w:val="4A4A45"/>
+          <w:sz w:val="24"/>
+        </w:rPr>
+        <w:t>, que mora em Curitiba. Três netos.</w:t>
       </w:r>
     </w:p>
     <w:p>
@@ -816,7 +874,23 @@
                 <w:color w:val="4A4A45"/>
                 <w:sz w:val="19"/>
               </w:rPr>
-              <w:t>“Sa... sal.” Depois aponta o próprio sapato, tenta falar, não sai som, e balança a cabeça. Encerrado o minuto, diz: “não... sai”.</w:t>
+              <w:t>“Sa... sal.</w:t>
+            </w:r>
+            <w:proofErr w:type="gramStart"/>
+            <w:r>
+              <w:rPr>
+                <w:color w:val="4A4A45"/>
+                <w:sz w:val="19"/>
+              </w:rPr>
+              <w:t>” Depois</w:t>
+            </w:r>
+            <w:proofErr w:type="gramEnd"/>
+            <w:r>
+              <w:rPr>
+                <w:color w:val="4A4A45"/>
+                <w:sz w:val="19"/>
+              </w:rPr>
+              <w:t xml:space="preserve"> aponta o próprio sapato, tenta falar, não sai som, e balança a cabeça. Encerrado o minuto, diz: “não... sai”.</w:t>
             </w:r>
           </w:p>
         </w:tc>
@@ -916,97 +990,6 @@
                 <w:sz w:val="19"/>
               </w:rPr>
               <w:t>Palavras ditas nos três minutos</w:t>
-            </w:r>
-          </w:p>
-        </w:tc>
-        <w:tc>
-          <w:tcPr>
-            <w:tcW w:w="3400" w:type="dxa"/>
-          </w:tcPr>
-          <w:p>
-            <w:r>
-              <w:rPr>
-                <w:color w:val="4A4A45"/>
-                <w:sz w:val="19"/>
-              </w:rPr>
-              <w:t>______</w:t>
-            </w:r>
-          </w:p>
-        </w:tc>
-      </w:tr>
-      <w:tr>
-        <w:tc>
-          <w:tcPr>
-            <w:tcW w:w="6200" w:type="dxa"/>
-          </w:tcPr>
-          <w:p>
-            <w:r>
-              <w:rPr>
-                <w:color w:val="4A4A45"/>
-                <w:sz w:val="19"/>
-              </w:rPr>
-              <w:t>Repetições</w:t>
-            </w:r>
-          </w:p>
-        </w:tc>
-        <w:tc>
-          <w:tcPr>
-            <w:tcW w:w="3400" w:type="dxa"/>
-          </w:tcPr>
-          <w:p>
-            <w:r>
-              <w:rPr>
-                <w:color w:val="4A4A45"/>
-                <w:sz w:val="19"/>
-              </w:rPr>
-              <w:t>______</w:t>
-            </w:r>
-          </w:p>
-        </w:tc>
-      </w:tr>
-      <w:tr>
-        <w:tc>
-          <w:tcPr>
-            <w:tcW w:w="6200" w:type="dxa"/>
-          </w:tcPr>
-          <w:p>
-            <w:r>
-              <w:rPr>
-                <w:color w:val="4A4A45"/>
-                <w:sz w:val="19"/>
-              </w:rPr>
-              <w:t>Palavras de outra letra</w:t>
-            </w:r>
-          </w:p>
-        </w:tc>
-        <w:tc>
-          <w:tcPr>
-            <w:tcW w:w="3400" w:type="dxa"/>
-          </w:tcPr>
-          <w:p>
-            <w:r>
-              <w:rPr>
-                <w:color w:val="4A4A45"/>
-                <w:sz w:val="19"/>
-              </w:rPr>
-              <w:t>______</w:t>
-            </w:r>
-          </w:p>
-        </w:tc>
-      </w:tr>
-      <w:tr>
-        <w:tc>
-          <w:tcPr>
-            <w:tcW w:w="6200" w:type="dxa"/>
-          </w:tcPr>
-          <w:p>
-            <w:r>
-              <w:rPr>
-                <w:color w:val="4A4A45"/>
-                <w:sz w:val="19"/>
-              </w:rPr>
-              <w:lastRenderedPageBreak/>
-              <w:t>Nomes próprios e mesma palavra com outra terminação</w:t>
             </w:r>
           </w:p>
         </w:tc>
@@ -1080,7 +1063,7 @@
                 <w:color w:val="4A4A45"/>
                 <w:sz w:val="19"/>
               </w:rPr>
-              <w:t>______ anos de idade · ______ anos de estudo</w:t>
+              <w:t>__anos de idade · __ anos de estudo</w:t>
             </w:r>
           </w:p>
         </w:tc>
@@ -1096,6 +1079,7 @@
                 <w:color w:val="4A4A45"/>
                 <w:sz w:val="19"/>
               </w:rPr>
+              <w:lastRenderedPageBreak/>
               <w:t>Percentis 5 e 25 da faixa de idade e escolaridade (Machado et al., 2009)</w:t>
             </w:r>
           </w:p>
@@ -1165,12 +1149,37 @@
             <w:tcW w:w="3400" w:type="dxa"/>
           </w:tcPr>
           <w:p>
+            <w:proofErr w:type="gramStart"/>
             <w:r>
               <w:rPr>
                 <w:color w:val="4A4A45"/>
                 <w:sz w:val="19"/>
               </w:rPr>
-              <w:t>(  ) dentro do esperado      (  ) abaixo do esperado</w:t>
+              <w:t>(  )</w:t>
+            </w:r>
+            <w:proofErr w:type="gramEnd"/>
+            <w:r>
+              <w:rPr>
+                <w:color w:val="4A4A45"/>
+                <w:sz w:val="19"/>
+              </w:rPr>
+              <w:t xml:space="preserve"> dentro do esperado   </w:t>
+            </w:r>
+            <w:proofErr w:type="gramStart"/>
+            <w:r>
+              <w:rPr>
+                <w:color w:val="4A4A45"/>
+                <w:sz w:val="19"/>
+              </w:rPr>
+              <w:t xml:space="preserve">   (  )</w:t>
+            </w:r>
+            <w:proofErr w:type="gramEnd"/>
+            <w:r>
+              <w:rPr>
+                <w:color w:val="4A4A45"/>
+                <w:sz w:val="19"/>
+              </w:rPr>
+              <w:t xml:space="preserve"> abaixo do esperado</w:t>
             </w:r>
           </w:p>
         </w:tc>

</xml_diff>